<commit_message>
feat: Add new serif resume template with enhanced layout and arrow bullet points
</commit_message>
<xml_diff>
--- a/resume_app/pdf/references/000.docx
+++ b/resume_app/pdf/references/000.docx
@@ -100,17 +100,61 @@
         <w:t>Engineer</w:t>
       </w:r>
     </w:p>
-    <w:p>
-      <w:pPr>
-        <w:pStyle w:val="Resume000Detail"/>
-      </w:pPr>
-      <w:r>
-        <w:t>Example Labs | 2020 - 2024</w:t>
-      </w:r>
-    </w:p>
+    <w:tbl>
+      <w:tblPr>
+        <w:tblW w:type="auto" w:w="0"/>
+        <w:tblLayout w:type="fixed"/>
+        <w:tblLook w:firstColumn="1" w:firstRow="1" w:lastColumn="0" w:lastRow="0" w:noHBand="0" w:noVBand="1" w:val="04A0"/>
+        <w:tblCellMar>
+          <w:top w:w="0" w:type="dxa"/>
+          <w:bottom w:w="0" w:type="dxa"/>
+          <w:left w:w="0" w:type="dxa"/>
+          <w:right w:w="0" w:type="dxa"/>
+        </w:tblCellMar>
+      </w:tblPr>
+      <w:tblGrid>
+        <w:gridCol w:w="6335"/>
+        <w:gridCol w:w="3411"/>
+      </w:tblGrid>
+      <w:tr>
+        <w:tc>
+          <w:tcPr>
+            <w:tcW w:type="dxa" w:w="6335"/>
+          </w:tcPr>
+          <w:p>
+            <w:pPr>
+              <w:pStyle w:val="Resume000Company"/>
+            </w:pPr>
+            <w:r>
+              <w:rPr>
+                <w:b/>
+              </w:rPr>
+              <w:t>Example Labs</w:t>
+            </w:r>
+          </w:p>
+        </w:tc>
+        <w:tc>
+          <w:tcPr>
+            <w:tcW w:type="dxa" w:w="3411"/>
+          </w:tcPr>
+          <w:p>
+            <w:pPr>
+              <w:pStyle w:val="Resume000Date"/>
+            </w:pPr>
+            <w:r>
+              <w:t>2020 - 2024</w:t>
+            </w:r>
+          </w:p>
+        </w:tc>
+      </w:tr>
+    </w:tbl>
     <w:p>
       <w:pPr>
         <w:pStyle w:val="Resume000Bullet"/>
+        <w:numPr>
+          <w:ilvl w:val="0"/>
+          <w:numId w:val="10"/>
+        </w:numPr>
       </w:pPr>
       <w:r>
         <w:t>Built Python services with 20% lower latency.</w:t>
@@ -143,6 +187,10 @@
     <w:p>
       <w:pPr>
         <w:pStyle w:val="Resume000Bullet"/>
+        <w:numPr>
+          <w:ilvl w:val="0"/>
+          <w:numId w:val="10"/>
+        </w:numPr>
       </w:pPr>
       <w:r>
         <w:t>Education detail</w:t>
@@ -215,6 +263,10 @@
     <w:p>
       <w:pPr>
         <w:pStyle w:val="Resume000Bullet"/>
+        <w:numPr>
+          <w:ilvl w:val="0"/>
+          <w:numId w:val="10"/>
+        </w:numPr>
       </w:pPr>
       <w:r>
         <w:t>Project result</w:t>
@@ -443,6 +495,20 @@
       </w:rPr>
     </w:lvl>
   </w:abstractNum>
+  <w:abstractNum w:abstractNumId="9">
+    <w:lvl w:ilvl="0">
+      <w:start w:val="1"/>
+      <w:numFmt w:val="bullet"/>
+      <w:lvlText w:val=""/>
+      <w:lvlJc w:val="left"/>
+      <w:pPr>
+        <w:ind w:left="420" w:hanging="420"/>
+      </w:pPr>
+      <w:rPr>
+        <w:rFonts w:ascii="Wingdings" w:hAnsi="Wingdings"/>
+      </w:rPr>
+    </w:lvl>
+  </w:abstractNum>
   <w:num w:numId="1">
     <w:abstractNumId w:val="8"/>
   </w:num>
@@ -469,6 +535,9 @@
   </w:num>
   <w:num w:numId="9">
     <w:abstractNumId w:val="0"/>
+  </w:num>
+  <w:num w:numId="10">
+    <w:abstractNumId w:val="9"/>
   </w:num>
 </w:numbering>
 </file>
@@ -12379,7 +12448,7 @@
       <w:jc w:val="left"/>
     </w:pPr>
     <w:rPr>
-      <w:rFonts w:ascii="Garamond" w:hAnsi="Garamond" w:eastAsia="SimSun"/>
+      <w:rFonts w:ascii="Calibri" w:hAnsi="Calibri" w:eastAsia="SimSun"/>
       <w:b w:val="0"/>
       <w:i/>
       <w:sz w:val="24"/>
@@ -12413,12 +12482,39 @@
       <w:sz w:val="23"/>
     </w:rPr>
   </w:style>
+  <w:style w:type="paragraph" w:customStyle="1" w:styleId="Resume000Company">
+    <w:name w:val="Resume000 Company"/>
+    <w:pPr>
+      <w:keepNext/>
+      <w:spacing w:after="80" w:line="252" w:lineRule="auto"/>
+      <w:jc w:val="left"/>
+    </w:pPr>
+    <w:rPr>
+      <w:rFonts w:ascii="Garamond" w:hAnsi="Garamond" w:eastAsia="SimSun"/>
+      <w:b w:val="0"/>
+      <w:i w:val="0"/>
+      <w:sz w:val="23"/>
+    </w:rPr>
+  </w:style>
+  <w:style w:type="paragraph" w:customStyle="1" w:styleId="Resume000Date">
+    <w:name w:val="Resume000 Date"/>
+    <w:pPr>
+      <w:keepNext/>
+      <w:spacing w:after="80" w:line="252" w:lineRule="auto"/>
+      <w:jc w:val="right"/>
+    </w:pPr>
+    <w:rPr>
+      <w:rFonts w:ascii="Garamond" w:hAnsi="Garamond" w:eastAsia="SimSun"/>
+      <w:b w:val="0"/>
+      <w:i w:val="0"/>
+      <w:sz w:val="23"/>
+    </w:rPr>
+  </w:style>
   <w:style w:type="paragraph" w:customStyle="1" w:styleId="Resume000Bullet">
     <w:name w:val="Resume000 Bullet"/>
-    <w:basedOn w:val="ListBullet"/>
     <w:pPr>
       <w:spacing w:after="80" w:line="252" w:lineRule="auto"/>
-      <w:ind w:left="280" w:hanging="240"/>
+      <w:ind w:left="420" w:hanging="420"/>
       <w:jc w:val="left"/>
     </w:pPr>
     <w:rPr>

</xml_diff>